<commit_message>
docs(research): freeze Thought1-5 paper and resume
</commit_message>
<xml_diff>
--- a/docs/resume/FastWAM项目经历_简略版.docx
+++ b/docs/resume/FastWAM项目经历_简略版.docx
@@ -6,7 +6,7 @@
       <w:pPr>
         <w:pStyle w:val="Heading1"/>
         <w:bidi w:val="0"/>
-        <w:spacing w:before="240" w:after="280"/>
+        <w:spacing w:before="240" w:after="200"/>
         <w:jc w:val="start"/>
         <w:rPr/>
       </w:pPr>
@@ -35,8 +35,8 @@
       <w:pPr>
         <w:pStyle w:val="TextBody"/>
         <w:bidi w:val="0"/>
-        <w:spacing w:before="100" w:after="100"/>
-        <w:ind w:start="100" w:end="100" w:hanging="0"/>
+        <w:spacing w:before="80" w:after="120"/>
+        <w:ind w:start="80" w:end="80" w:hanging="0"/>
         <w:jc w:val="start"/>
         <w:rPr/>
       </w:pPr>
@@ -64,15 +64,15 @@
       </w:r>
       <w:r>
         <w:rPr/>
-        <w:t>2026.07</w:t>
+        <w:t>2026.07–08</w:t>
       </w:r>
     </w:p>
     <w:p>
       <w:pPr>
         <w:pStyle w:val="TextBody"/>
         <w:bidi w:val="0"/>
-        <w:spacing w:before="100" w:after="100"/>
-        <w:ind w:start="100" w:end="100" w:hanging="0"/>
+        <w:spacing w:before="80" w:after="120"/>
+        <w:ind w:start="80" w:end="80" w:hanging="0"/>
         <w:jc w:val="start"/>
         <w:rPr/>
       </w:pPr>
@@ -158,11 +158,11 @@
         </w:numPr>
         <w:tabs>
           <w:tab w:val="clear" w:pos="1134"/>
-          <w:tab w:val="left" w:pos="809" w:leader="none"/>
+          <w:tab w:val="left" w:pos="789" w:leader="none"/>
         </w:tabs>
         <w:bidi w:val="0"/>
-        <w:spacing w:before="100" w:after="0"/>
-        <w:ind w:start="809" w:end="100" w:hanging="283"/>
+        <w:spacing w:before="80" w:after="0"/>
+        <w:ind w:start="789" w:end="80" w:hanging="283"/>
         <w:jc w:val="start"/>
         <w:rPr/>
       </w:pPr>
@@ -228,7 +228,7 @@
         <w:rPr>
           <w:rStyle w:val="SourceText"/>
         </w:rPr>
-        <w:t>397 passed</w:t>
+        <w:t>504 passed</w:t>
       </w:r>
       <w:r>
         <w:rPr/>
@@ -244,11 +244,11 @@
         </w:numPr>
         <w:tabs>
           <w:tab w:val="clear" w:pos="1134"/>
-          <w:tab w:val="left" w:pos="809" w:leader="none"/>
+          <w:tab w:val="left" w:pos="789" w:leader="none"/>
         </w:tabs>
         <w:bidi w:val="0"/>
-        <w:spacing w:before="100" w:after="0"/>
-        <w:ind w:start="809" w:end="100" w:hanging="283"/>
+        <w:spacing w:before="80" w:after="0"/>
+        <w:ind w:start="789" w:end="80" w:hanging="283"/>
         <w:jc w:val="start"/>
         <w:rPr/>
       </w:pPr>
@@ -424,11 +424,11 @@
         </w:numPr>
         <w:tabs>
           <w:tab w:val="clear" w:pos="1134"/>
-          <w:tab w:val="left" w:pos="809" w:leader="none"/>
+          <w:tab w:val="left" w:pos="789" w:leader="none"/>
         </w:tabs>
         <w:bidi w:val="0"/>
-        <w:spacing w:before="100" w:after="0"/>
-        <w:ind w:start="809" w:end="100" w:hanging="283"/>
+        <w:spacing w:before="80" w:after="0"/>
+        <w:ind w:start="789" w:end="80" w:hanging="283"/>
         <w:jc w:val="start"/>
         <w:rPr/>
       </w:pPr>
@@ -570,10 +570,11 @@
         </w:numPr>
         <w:tabs>
           <w:tab w:val="clear" w:pos="1134"/>
-          <w:tab w:val="left" w:pos="809" w:leader="none"/>
+          <w:tab w:val="left" w:pos="789" w:leader="none"/>
         </w:tabs>
         <w:bidi w:val="0"/>
-        <w:ind w:start="809" w:end="100" w:hanging="283"/>
+        <w:spacing w:before="80" w:after="0"/>
+        <w:ind w:start="789" w:end="80" w:hanging="283"/>
         <w:jc w:val="start"/>
         <w:rPr/>
       </w:pPr>
@@ -696,6 +697,347 @@
       <w:r>
         <w:rPr/>
         <w:t xml:space="preserve">扩展，保留有效负结果。 </w:t>
+      </w:r>
+    </w:p>
+    <w:p>
+      <w:pPr>
+        <w:pStyle w:val="TextBody"/>
+        <w:numPr>
+          <w:ilvl w:val="0"/>
+          <w:numId w:val="1"/>
+        </w:numPr>
+        <w:tabs>
+          <w:tab w:val="clear" w:pos="1134"/>
+          <w:tab w:val="left" w:pos="789" w:leader="none"/>
+        </w:tabs>
+        <w:bidi w:val="0"/>
+        <w:spacing w:before="80" w:after="0"/>
+        <w:ind w:start="789" w:end="80" w:hanging="283"/>
+        <w:jc w:val="start"/>
+        <w:rPr/>
+      </w:pPr>
+      <w:r>
+        <w:rPr/>
+        <w:t xml:space="preserve">在 </w:t>
+      </w:r>
+      <w:r>
+        <w:rPr>
+          <w:rStyle w:val="SourceText"/>
+        </w:rPr>
+        <w:t>64</w:t>
+      </w:r>
+      <w:r>
+        <w:rPr/>
+        <w:t xml:space="preserve"> </w:t>
+      </w:r>
+      <w:r>
+        <w:rPr/>
+        <w:t xml:space="preserve">个 </w:t>
+      </w:r>
+      <w:r>
+        <w:rPr/>
+        <w:t>base state</w:t>
+      </w:r>
+      <w:r>
+        <w:rPr/>
+        <w:t>、</w:t>
+      </w:r>
+      <w:r>
+        <w:rPr>
+          <w:rStyle w:val="SourceText"/>
+        </w:rPr>
+        <w:t>256</w:t>
+      </w:r>
+      <w:r>
+        <w:rPr/>
+        <w:t xml:space="preserve"> </w:t>
+      </w:r>
+      <w:r>
+        <w:rPr/>
+        <w:t xml:space="preserve">个配对样本和 </w:t>
+      </w:r>
+      <w:r>
+        <w:rPr>
+          <w:rStyle w:val="SourceText"/>
+        </w:rPr>
+        <w:t>12,544</w:t>
+      </w:r>
+      <w:r>
+        <w:rPr/>
+        <w:t xml:space="preserve"> </w:t>
+      </w:r>
+      <w:r>
+        <w:rPr/>
+        <w:t xml:space="preserve">条冻结特征上定位 </w:t>
+      </w:r>
+      <w:r>
+        <w:rPr/>
+        <w:t>Camera geometry gap</w:t>
+      </w:r>
+      <w:r>
+        <w:rPr/>
+        <w:t>（</w:t>
+      </w:r>
+      <w:r>
+        <w:rPr>
+          <w:rStyle w:val="SourceText"/>
+        </w:rPr>
+        <w:t>+0.020273 m</w:t>
+      </w:r>
+      <w:r>
+        <w:rPr/>
+        <w:t xml:space="preserve">）高于 </w:t>
+      </w:r>
+      <w:r>
+        <w:rPr/>
+        <w:t>Lighting</w:t>
+      </w:r>
+      <w:r>
+        <w:rPr/>
+        <w:t>（</w:t>
+      </w:r>
+      <w:r>
+        <w:rPr>
+          <w:rStyle w:val="SourceText"/>
+        </w:rPr>
+        <w:t>+0.011660 m</w:t>
+      </w:r>
+      <w:r>
+        <w:rPr/>
+        <w:t>）；</w:t>
+      </w:r>
+      <w:r>
+        <w:rPr/>
+        <w:t xml:space="preserve">rank-3 correct/shuffle </w:t>
+      </w:r>
+      <w:r>
+        <w:rPr/>
+        <w:t xml:space="preserve">干预以 </w:t>
+      </w:r>
+      <w:r>
+        <w:rPr>
+          <w:rStyle w:val="SourceText"/>
+        </w:rPr>
+        <w:t>36/36</w:t>
+      </w:r>
+      <w:r>
+        <w:rPr/>
+        <w:t xml:space="preserve"> </w:t>
+      </w:r>
+      <w:r>
+        <w:rPr/>
+        <w:t>逐位恢复</w:t>
+      </w:r>
+      <w:r>
+        <w:rPr/>
+        <w:t>/</w:t>
+      </w:r>
+      <w:r>
+        <w:rPr/>
+        <w:t xml:space="preserve">超过 </w:t>
+      </w:r>
+      <w:r>
+        <w:rPr/>
+        <w:t xml:space="preserve">replay floor </w:t>
+      </w:r>
+      <w:r>
+        <w:rPr/>
+        <w:t xml:space="preserve">将下一假设收敛为 </w:t>
+      </w:r>
+      <w:r>
+        <w:rPr/>
+        <w:t>camera equivariance</w:t>
+      </w:r>
+      <w:r>
+        <w:rPr/>
+        <w:t xml:space="preserve">，不将离线动作变化写成任务收益。 </w:t>
+      </w:r>
+    </w:p>
+    <w:p>
+      <w:pPr>
+        <w:pStyle w:val="TextBody"/>
+        <w:numPr>
+          <w:ilvl w:val="0"/>
+          <w:numId w:val="1"/>
+        </w:numPr>
+        <w:tabs>
+          <w:tab w:val="clear" w:pos="1134"/>
+          <w:tab w:val="left" w:pos="789" w:leader="none"/>
+        </w:tabs>
+        <w:bidi w:val="0"/>
+        <w:ind w:start="789" w:end="80" w:hanging="283"/>
+        <w:jc w:val="start"/>
+        <w:rPr/>
+      </w:pPr>
+      <w:r>
+        <w:rPr/>
+        <w:t xml:space="preserve">基于诊断实现 </w:t>
+      </w:r>
+      <w:r>
+        <w:rPr>
+          <w:rStyle w:val="SourceText"/>
+        </w:rPr>
+        <w:t>1.335M</w:t>
+      </w:r>
+      <w:r>
+        <w:rPr/>
+        <w:t xml:space="preserve"> </w:t>
+      </w:r>
+      <w:r>
+        <w:rPr/>
+        <w:t xml:space="preserve">参数 </w:t>
+      </w:r>
+      <w:r>
+        <w:rPr/>
+        <w:t>Fast-WAM-GeoEq</w:t>
+      </w:r>
+      <w:r>
+        <w:rPr/>
+        <w:t xml:space="preserve">，并在 </w:t>
+      </w:r>
+      <w:r>
+        <w:rPr>
+          <w:rStyle w:val="SourceText"/>
+        </w:rPr>
+        <w:t>3×RTX 4090</w:t>
+      </w:r>
+      <w:r>
+        <w:rPr/>
+        <w:t xml:space="preserve"> </w:t>
+      </w:r>
+      <w:r>
+        <w:rPr/>
+        <w:t xml:space="preserve">上完成 </w:t>
+      </w:r>
+      <w:r>
+        <w:rPr/>
+        <w:t xml:space="preserve">B1/G3/G4 </w:t>
+      </w:r>
+      <w:r>
+        <w:rPr/>
+        <w:t xml:space="preserve">单任务 </w:t>
+      </w:r>
+      <w:r>
+        <w:rPr/>
+        <w:t>matched Pilot</w:t>
+      </w:r>
+      <w:r>
+        <w:rPr/>
+        <w:t>；</w:t>
+      </w:r>
+      <w:r>
+        <w:rPr/>
+        <w:t xml:space="preserve">G3 Camera gap </w:t>
+      </w:r>
+      <w:r>
+        <w:rPr/>
+        <w:t xml:space="preserve">缩小 </w:t>
+      </w:r>
+      <w:r>
+        <w:rPr>
+          <w:rStyle w:val="SourceText"/>
+        </w:rPr>
+        <w:t>20.94%&lt;25%</w:t>
+      </w:r>
+      <w:r>
+        <w:rPr/>
+        <w:t>、</w:t>
+      </w:r>
+      <w:r>
+        <w:rPr/>
+        <w:t xml:space="preserve">future utility </w:t>
+      </w:r>
+      <w:r>
+        <w:rPr/>
+        <w:t xml:space="preserve">仍为 </w:t>
+      </w:r>
+      <w:r>
+        <w:rPr>
+          <w:rStyle w:val="SourceText"/>
+        </w:rPr>
+        <w:t>−</w:t>
+      </w:r>
+      <w:r>
+        <w:rPr>
+          <w:rStyle w:val="SourceText"/>
+        </w:rPr>
+        <w:t>0.005231</w:t>
+      </w:r>
+      <w:r>
+        <w:rPr/>
+        <w:t>、</w:t>
+      </w:r>
+      <w:r>
+        <w:rPr/>
+        <w:t xml:space="preserve">Camera success </w:t>
+      </w:r>
+      <w:r>
+        <w:rPr/>
+        <w:t xml:space="preserve">与基线同为 </w:t>
+      </w:r>
+      <w:r>
+        <w:rPr>
+          <w:rStyle w:val="SourceText"/>
+        </w:rPr>
+        <w:t>1/4</w:t>
+      </w:r>
+      <w:r>
+        <w:rPr/>
+        <w:t xml:space="preserve">，遂停止预计 </w:t>
+      </w:r>
+      <w:r>
+        <w:rPr>
+          <w:rStyle w:val="SourceText"/>
+        </w:rPr>
+        <w:t>28–45 h</w:t>
+      </w:r>
+      <w:r>
+        <w:rPr/>
+        <w:t xml:space="preserve"> </w:t>
+      </w:r>
+      <w:r>
+        <w:rPr/>
+        <w:t xml:space="preserve">的 </w:t>
+      </w:r>
+      <w:r>
+        <w:rPr/>
+        <w:t>formal</w:t>
+      </w:r>
+      <w:r>
+        <w:rPr/>
+        <w:t xml:space="preserve">，并以 </w:t>
+      </w:r>
+      <w:r>
+        <w:rPr/>
+        <w:t xml:space="preserve">CPU-only </w:t>
+      </w:r>
+      <w:r>
+        <w:rPr/>
+        <w:t xml:space="preserve">只读分解定位 </w:t>
+      </w:r>
+      <w:r>
+        <w:rPr/>
+        <w:t>Clean/</w:t>
+      </w:r>
+      <w:r>
+        <w:rPr/>
+        <w:t xml:space="preserve">低 </w:t>
+      </w:r>
+      <w:r>
+        <w:rPr/>
+        <w:t xml:space="preserve">sigma </w:t>
+      </w:r>
+      <w:r>
+        <w:rPr/>
+        <w:t xml:space="preserve">伤害及 </w:t>
+      </w:r>
+      <w:r>
+        <w:rPr/>
+        <w:t xml:space="preserve">RayPose </w:t>
+      </w:r>
+      <w:r>
+        <w:rPr/>
+        <w:t xml:space="preserve">因果缺口。 </w:t>
       </w:r>
     </w:p>
     <w:p>
@@ -718,14 +1060,14 @@
       <w:pPr>
         <w:pStyle w:val="TextBody"/>
         <w:bidi w:val="0"/>
-        <w:spacing w:before="100" w:after="100"/>
-        <w:ind w:start="100" w:end="100" w:hanging="0"/>
+        <w:spacing w:before="80" w:after="120"/>
+        <w:ind w:start="80" w:end="80" w:hanging="0"/>
         <w:jc w:val="start"/>
         <w:rPr/>
       </w:pPr>
       <w:r>
         <w:rPr/>
-        <w:t xml:space="preserve">我没有直接把“能生成未来”当成“未来对控制有用”，而是把问题拆成四层：先测同一模型在 </w:t>
+        <w:t xml:space="preserve">我没有直接把“能生成未来”当成“未来对控制有用”，而是先验证 </w:t>
       </w:r>
       <w:r>
         <w:rPr/>
@@ -733,65 +1075,105 @@
       </w:r>
       <w:r>
         <w:rPr/>
-        <w:t xml:space="preserve">下是否真的掉点，再用不改变动作的 </w:t>
-      </w:r>
-      <w:r>
-        <w:rPr/>
-        <w:t xml:space="preserve">shadow probe </w:t>
-      </w:r>
-      <w:r>
-        <w:rPr/>
-        <w:t xml:space="preserve">看未来预测与失败是否相关，然后用 </w:t>
-      </w:r>
-      <w:r>
-        <w:rPr/>
-        <w:t xml:space="preserve">correct/null/shuffle </w:t>
-      </w:r>
-      <w:r>
-        <w:rPr/>
-        <w:t xml:space="preserve">反事实确认 </w:t>
-      </w:r>
-      <w:r>
-        <w:rPr/>
-        <w:t xml:space="preserve">future </w:t>
-      </w:r>
-      <w:r>
-        <w:rPr/>
-        <w:t xml:space="preserve">内容是否进入动作，最后用 </w:t>
-      </w:r>
-      <w:r>
-        <w:rPr/>
-        <w:t xml:space="preserve">K=0/K=1 matched </w:t>
-      </w:r>
-      <w:r>
-        <w:rPr/>
-        <w:t xml:space="preserve">训练检验这种敏感性是否形成 </w:t>
-      </w:r>
-      <w:r>
-        <w:rPr/>
-        <w:t xml:space="preserve">held-out </w:t>
-      </w:r>
-      <w:r>
-        <w:rPr/>
-        <w:t xml:space="preserve">收益。前三层分别观察到行为缺口、相关性和动作敏感性，但第四层没有得到正向收益，因此我按预先冻结的停止规则保留负结果，没有用 </w:t>
-      </w:r>
-      <w:r>
-        <w:rPr/>
-        <w:t xml:space="preserve">OOD outcome </w:t>
-      </w:r>
-      <w:r>
-        <w:rPr/>
-        <w:t>继续反向调参。</w:t>
+        <w:t xml:space="preserve">行为缺口，再依次检查 </w:t>
+      </w:r>
+      <w:r>
+        <w:rPr/>
+        <w:t xml:space="preserve">shadow-future </w:t>
+      </w:r>
+      <w:r>
+        <w:rPr/>
+        <w:t>关联、</w:t>
+      </w:r>
+      <w:r>
+        <w:rPr/>
+        <w:t xml:space="preserve">future-content </w:t>
+      </w:r>
+      <w:r>
+        <w:rPr/>
+        <w:t xml:space="preserve">动作敏感性和 </w:t>
+      </w:r>
+      <w:r>
+        <w:rPr/>
+        <w:t>K=0/K=1 held-out utility</w:t>
+      </w:r>
+      <w:r>
+        <w:rPr/>
+        <w:t>。</w:t>
+      </w:r>
+      <w:r>
+        <w:rPr/>
+        <w:t xml:space="preserve">K=1 </w:t>
+      </w:r>
+      <w:r>
+        <w:rPr/>
+        <w:t xml:space="preserve">没有正向收益后，我按冻结规则停止 </w:t>
+      </w:r>
+      <w:r>
+        <w:rPr/>
+        <w:t xml:space="preserve">OOD </w:t>
+      </w:r>
+      <w:r>
+        <w:rPr/>
+        <w:t xml:space="preserve">扩展；随后用 </w:t>
+      </w:r>
+      <w:r>
+        <w:rPr/>
+        <w:t xml:space="preserve">exact-state probe </w:t>
+      </w:r>
+      <w:r>
+        <w:rPr/>
+        <w:t xml:space="preserve">定位 </w:t>
+      </w:r>
+      <w:r>
+        <w:rPr/>
+        <w:t xml:space="preserve">Camera </w:t>
+      </w:r>
+      <w:r>
+        <w:rPr/>
+        <w:t xml:space="preserve">等变性缺口，并三卡验证针对性 </w:t>
+      </w:r>
+      <w:r>
+        <w:rPr/>
+        <w:t xml:space="preserve">GeoEq </w:t>
+      </w:r>
+      <w:r>
+        <w:rPr/>
+        <w:t>配方。</w:t>
+      </w:r>
+      <w:r>
+        <w:rPr/>
+        <w:t xml:space="preserve">Pilot </w:t>
+      </w:r>
+      <w:r>
+        <w:rPr/>
+        <w:t xml:space="preserve">仍未过门，所以我停止 </w:t>
+      </w:r>
+      <w:r>
+        <w:rPr/>
+        <w:t>formal</w:t>
+      </w:r>
+      <w:r>
+        <w:rPr/>
+        <w:t xml:space="preserve">，只用已有工件定位下一条 </w:t>
+      </w:r>
+      <w:r>
+        <w:rPr/>
+        <w:t xml:space="preserve">condition-aware/low-noise </w:t>
+      </w:r>
+      <w:r>
+        <w:rPr/>
+        <w:t>假设。</w:t>
       </w:r>
     </w:p>
     <w:sectPr>
       <w:type w:val="nextPage"/>
       <w:pgSz w:w="11906" w:h="16838"/>
-      <w:pgMar w:left="1134" w:right="1134" w:gutter="0" w:header="0" w:top="1020" w:footer="0" w:bottom="1020"/>
+      <w:pgMar w:left="879" w:right="879" w:gutter="0" w:header="0" w:top="822" w:footer="0" w:bottom="822"/>
       <w:pgNumType w:fmt="decimal"/>
       <w:formProt w:val="false"/>
       <w:textDirection w:val="lrTb"/>
-      <w:docGrid w:type="default" w:linePitch="600" w:charSpace="38911"/>
+      <w:docGrid w:type="default" w:linePitch="600" w:charSpace="40140"/>
     </w:sectPr>
   </w:body>
 </w:document>
@@ -1089,13 +1471,13 @@
     <w:pPr>
       <w:widowControl w:val="false"/>
       <w:bidi w:val="0"/>
-      <w:spacing w:lineRule="auto" w:line="372"/>
+      <w:spacing w:lineRule="auto" w:line="355"/>
     </w:pPr>
     <w:rPr>
       <w:rFonts w:ascii="Noto Sans CJK SC;Microsoft YaHei;sans-serif" w:hAnsi="Noto Sans CJK SC;Microsoft YaHei;sans-serif" w:eastAsia="Noto Sans CJK SC;Microsoft YaHei;sans-serif" w:cs="Noto Sans CJK SC;Microsoft YaHei;sans-serif"/>
-      <w:color w:val="20252B"/>
-      <w:sz w:val="21"/>
-      <w:szCs w:val="21"/>
+      <w:color w:val="172033"/>
+      <w:sz w:val="20"/>
+      <w:szCs w:val="20"/>
       <w:lang w:val="en-US" w:eastAsia="zh-CN" w:bidi="hi-IN"/>
     </w:rPr>
   </w:style>
@@ -1105,13 +1487,16 @@
     <w:next w:val="TextBody"/>
     <w:qFormat/>
     <w:pPr>
-      <w:spacing w:before="240" w:after="280"/>
+      <w:pBdr>
+        <w:bottom w:val="single" w:sz="16" w:space="5" w:color="3568B0"/>
+      </w:pBdr>
+      <w:spacing w:before="240" w:after="200"/>
     </w:pPr>
     <w:rPr>
       <w:rFonts w:ascii="Liberation Sans Unicode MS" w:hAnsi="Liberation Sans Unicode MS"/>
       <w:b/>
       <w:bCs/>
-      <w:color w:val="17365D"/>
+      <w:color w:val="173B66"/>
       <w:sz w:val="40"/>
       <w:szCs w:val="40"/>
     </w:rPr>
@@ -1123,16 +1508,17 @@
     <w:qFormat/>
     <w:pPr>
       <w:pBdr>
-        <w:bottom w:val="single" w:sz="2" w:space="4" w:color="B9C7D5"/>
+        <w:bottom w:val="single" w:sz="4" w:space="2" w:color="B7C9DF"/>
       </w:pBdr>
-      <w:spacing w:before="360" w:after="120"/>
+      <w:spacing w:before="280" w:after="120"/>
+      <w:ind w:start="280" w:end="280" w:hanging="0"/>
       <w:outlineLvl w:val="1"/>
     </w:pPr>
     <w:rPr>
       <w:rFonts w:ascii="Liberation Serif" w:hAnsi="Liberation Serif" w:eastAsia="Noto Serif CJK SC" w:cs="Lohit Devanagari"/>
       <w:b/>
       <w:bCs/>
-      <w:color w:val="244A73"/>
+      <w:color w:val="244F7F"/>
       <w:sz w:val="28"/>
       <w:szCs w:val="28"/>
     </w:rPr>
@@ -1143,14 +1529,15 @@
     <w:next w:val="TextBody"/>
     <w:qFormat/>
     <w:pPr>
-      <w:spacing w:before="280" w:after="120"/>
+      <w:spacing w:before="200" w:after="80"/>
+      <w:ind w:start="200" w:end="200" w:hanging="0"/>
       <w:outlineLvl w:val="2"/>
     </w:pPr>
     <w:rPr>
       <w:rFonts w:ascii="Liberation Serif" w:hAnsi="Liberation Serif" w:eastAsia="Noto Serif CJK SC" w:cs="Lohit Devanagari"/>
       <w:b/>
       <w:bCs/>
-      <w:color w:val="315F88"/>
+      <w:color w:val="315F8F"/>
       <w:sz w:val="23"/>
       <w:szCs w:val="23"/>
     </w:rPr>
@@ -1168,16 +1555,11 @@
   <w:style w:type="character" w:styleId="InternetLink">
     <w:name w:val="Hyperlink"/>
     <w:rPr>
-      <w:color w:val="000080"/>
-      <w:u w:val="single"/>
-    </w:rPr>
-  </w:style>
-  <w:style w:type="character" w:styleId="SourceText">
-    <w:name w:val="Source Text"/>
-    <w:qFormat/>
-    <w:rPr>
-      <w:rFonts w:ascii="Liberation Mono;monospace" w:hAnsi="Liberation Mono;monospace" w:eastAsia="Liberation Mono;monospace" w:cs="Liberation Mono;monospace"/>
-      <w:shd w:fill="F2F4F7" w:val="clear"/>
+      <w:strike w:val="false"/>
+      <w:dstrike w:val="false"/>
+      <w:color w:val="285F9D"/>
+      <w:u w:val="none"/>
+      <w:effect w:val="none"/>
     </w:rPr>
   </w:style>
   <w:style w:type="character" w:styleId="StrongEmphasis">
@@ -1186,6 +1568,18 @@
     <w:rPr>
       <w:b/>
       <w:bCs/>
+      <w:color w:val="152F4E"/>
+    </w:rPr>
+  </w:style>
+  <w:style w:type="character" w:styleId="SourceText">
+    <w:name w:val="Source Text"/>
+    <w:qFormat/>
+    <w:rPr>
+      <w:rFonts w:ascii="DejaVu Sans Mono;monospace" w:hAnsi="DejaVu Sans Mono;monospace" w:eastAsia="DejaVu Sans Mono;monospace" w:cs="DejaVu Sans Mono;monospace"/>
+      <w:color w:val="24364B"/>
+      <w:sz w:val="18"/>
+      <w:szCs w:val="18"/>
+      <w:shd w:fill="EEF3F8" w:val="clear"/>
     </w:rPr>
   </w:style>
   <w:style w:type="character" w:styleId="Bullets">
@@ -1193,6 +1587,16 @@
     <w:qFormat/>
     <w:rPr>
       <w:rFonts w:ascii="OpenSymbol" w:hAnsi="OpenSymbol" w:eastAsia="OpenSymbol" w:cs="OpenSymbol"/>
+    </w:rPr>
+  </w:style>
+  <w:style w:type="character" w:styleId="VisitedInternetLink">
+    <w:name w:val="FollowedHyperlink"/>
+    <w:rPr>
+      <w:strike w:val="false"/>
+      <w:dstrike w:val="false"/>
+      <w:color w:val="285F9D"/>
+      <w:u w:val="none"/>
+      <w:effect w:val="none"/>
     </w:rPr>
   </w:style>
   <w:style w:type="paragraph" w:styleId="HorizontalLine">
@@ -1304,8 +1708,8 @@
     <w:name w:val="Body Text"/>
     <w:basedOn w:val="Normal"/>
     <w:pPr>
-      <w:spacing w:before="100" w:after="100"/>
-      <w:ind w:start="100" w:end="100" w:hanging="0"/>
+      <w:spacing w:before="80" w:after="120"/>
+      <w:ind w:start="80" w:end="80" w:hanging="0"/>
     </w:pPr>
     <w:rPr/>
   </w:style>
@@ -1330,18 +1734,15 @@
     <w:qFormat/>
     <w:pPr>
       <w:pBdr>
-        <w:top w:val="single" w:sz="2" w:space="8" w:color="D7DDE3"/>
-        <w:left w:val="single" w:sz="2" w:space="8" w:color="D7DDE3"/>
-        <w:bottom w:val="single" w:sz="2" w:space="8" w:color="D7DDE3"/>
-        <w:right w:val="single" w:sz="2" w:space="8" w:color="D7DDE3"/>
+        <w:left w:val="single" w:sz="24" w:space="7" w:color="7D9FC4"/>
       </w:pBdr>
-      <w:shd w:fill="F5F7F9" w:val="clear"/>
-      <w:spacing w:before="0" w:after="0"/>
+      <w:shd w:fill="F3F6F9" w:val="clear"/>
+      <w:spacing w:lineRule="auto" w:line="324" w:before="0" w:after="0"/>
     </w:pPr>
     <w:rPr>
-      <w:rFonts w:ascii="Liberation Mono" w:hAnsi="Liberation Mono" w:eastAsia="Noto Sans Mono CJK SC" w:cs="Liberation Mono"/>
-      <w:sz w:val="20"/>
-      <w:szCs w:val="20"/>
+      <w:rFonts w:ascii="DejaVu Sans Mono;monospace" w:hAnsi="DejaVu Sans Mono;monospace" w:eastAsia="DejaVu Sans Mono;monospace" w:cs="DejaVu Sans Mono;monospace"/>
+      <w:sz w:val="17"/>
+      <w:szCs w:val="17"/>
     </w:rPr>
   </w:style>
   <w:style w:type="paragraph" w:styleId="Quotations">
@@ -1350,14 +1751,13 @@
     <w:qFormat/>
     <w:pPr>
       <w:pBdr>
-        <w:left w:val="single" w:sz="18" w:space="10" w:color="7B9BB8"/>
+        <w:left w:val="single" w:sz="24" w:space="9" w:color="3568B0"/>
       </w:pBdr>
-      <w:spacing w:before="0" w:after="283"/>
-      <w:ind w:start="567" w:end="567" w:hanging="0"/>
+      <w:shd w:fill="F3F7FB" w:val="clear"/>
+      <w:spacing w:before="120" w:after="120"/>
+      <w:ind w:start="120" w:end="120" w:hanging="0"/>
     </w:pPr>
-    <w:rPr>
-      <w:color w:val="4B5563"/>
-    </w:rPr>
+    <w:rPr/>
   </w:style>
   <w:style w:type="paragraph" w:styleId="TableHeading">
     <w:name w:val="Table Heading"/>
@@ -1365,13 +1765,13 @@
     <w:qFormat/>
     <w:pPr>
       <w:suppressLineNumbers/>
-      <w:shd w:fill="EAF0F5" w:val="clear"/>
+      <w:shd w:fill="DCE8F7" w:val="clear"/>
       <w:jc w:val="center"/>
     </w:pPr>
     <w:rPr>
       <w:b/>
       <w:bCs/>
-      <w:color w:val="17365D"/>
+      <w:color w:val="173B66"/>
     </w:rPr>
   </w:style>
 </w:styles>

</xml_diff>

<commit_message>
fix(docs): update project descriptions and clarify hypothesis in resume documents
</commit_message>
<xml_diff>
--- a/docs/resume/FastWAM项目经历_简略版.docx
+++ b/docs/resume/FastWAM项目经历_简略版.docx
@@ -56,7 +56,19 @@
         <w:rPr>
           <w:rStyle w:val="StrongEmphasis"/>
         </w:rPr>
-        <w:t>泛化评测与未来效用审计</w:t>
+        <w:t xml:space="preserve">泛化与 </w:t>
+      </w:r>
+      <w:r>
+        <w:rPr>
+          <w:rStyle w:val="StrongEmphasis"/>
+        </w:rPr>
+        <w:t xml:space="preserve">Future Utility </w:t>
+      </w:r>
+      <w:r>
+        <w:rPr>
+          <w:rStyle w:val="StrongEmphasis"/>
+        </w:rPr>
+        <w:t>机制证伪</w:t>
       </w:r>
       <w:r>
         <w:rPr/>
@@ -610,31 +622,15 @@
       </w:r>
       <w:r>
         <w:rPr/>
-        <w:t xml:space="preserve">，以 </w:t>
-      </w:r>
-      <w:r>
-        <w:rPr/>
-        <w:t xml:space="preserve">parameter-free null </w:t>
-      </w:r>
-      <w:r>
-        <w:rPr/>
-        <w:t xml:space="preserve">和跨 </w:t>
-      </w:r>
-      <w:r>
-        <w:rPr/>
-        <w:t xml:space="preserve">episode shuffle </w:t>
-      </w:r>
-      <w:r>
-        <w:rPr/>
-        <w:t xml:space="preserve">构造 </w:t>
-      </w:r>
-      <w:r>
-        <w:rPr/>
-        <w:t xml:space="preserve">K=1 </w:t>
-      </w:r>
-      <w:r>
-        <w:rPr/>
-        <w:t xml:space="preserve">动作反事实，验证 </w:t>
+        <w:t xml:space="preserve">，用 </w:t>
+      </w:r>
+      <w:r>
+        <w:rPr/>
+        <w:t xml:space="preserve">correct/null/shuffle </w:t>
+      </w:r>
+      <w:r>
+        <w:rPr/>
+        <w:t xml:space="preserve">反事实证明 </w:t>
       </w:r>
       <w:r>
         <w:rPr/>
@@ -656,7 +652,7 @@
       </w:r>
       <w:r>
         <w:rPr/>
-        <w:t xml:space="preserve">固定样本上改变动作；随后执行双 </w:t>
+        <w:t xml:space="preserve">样本上改变动作；随后执行双 </w:t>
       </w:r>
       <w:r>
         <w:rPr/>
@@ -672,31 +668,63 @@
       </w:r>
       <w:r>
         <w:rPr/>
-        <w:t xml:space="preserve">训练，发现 </w:t>
-      </w:r>
-      <w:r>
-        <w:rPr/>
-        <w:t xml:space="preserve">K=1 </w:t>
-      </w:r>
-      <w:r>
-        <w:rPr/>
-        <w:t xml:space="preserve">未改善 </w:t>
-      </w:r>
-      <w:r>
-        <w:rPr/>
-        <w:t>held-out objective</w:t>
-      </w:r>
-      <w:r>
-        <w:rPr/>
-        <w:t xml:space="preserve">，并按冻结停止规则终止 </w:t>
-      </w:r>
-      <w:r>
-        <w:rPr/>
-        <w:t xml:space="preserve">OOD </w:t>
-      </w:r>
-      <w:r>
-        <w:rPr/>
-        <w:t xml:space="preserve">扩展，保留有效负结果。 </w:t>
+        <w:t>训练，</w:t>
+      </w:r>
+      <w:r>
+        <w:rPr/>
+        <w:t xml:space="preserve">K=1 held-out loss </w:t>
+      </w:r>
+      <w:r>
+        <w:rPr/>
+        <w:t xml:space="preserve">比 </w:t>
+      </w:r>
+      <w:r>
+        <w:rPr/>
+        <w:t xml:space="preserve">K=0 </w:t>
+      </w:r>
+      <w:r>
+        <w:rPr/>
+        <w:t xml:space="preserve">高 </w:t>
+      </w:r>
+      <w:r>
+        <w:rPr>
+          <w:rStyle w:val="SourceText"/>
+        </w:rPr>
+        <w:t>3.624%</w:t>
+      </w:r>
+      <w:r>
+        <w:rPr/>
+        <w:t>、</w:t>
+      </w:r>
+      <w:r>
+        <w:rPr>
+          <w:rStyle w:val="SourceText"/>
+        </w:rPr>
+        <w:t>4/4</w:t>
+      </w:r>
+      <w:r>
+        <w:rPr/>
+        <w:t xml:space="preserve"> </w:t>
+      </w:r>
+      <w:r>
+        <w:rPr/>
+        <w:t xml:space="preserve">样本更差，证明 </w:t>
+      </w:r>
+      <w:r>
+        <w:rPr/>
+        <w:t xml:space="preserve">action sensitivity </w:t>
+      </w:r>
+      <w:r>
+        <w:rPr/>
+        <w:t xml:space="preserve">不等于 </w:t>
+      </w:r>
+      <w:r>
+        <w:rPr/>
+        <w:t>future utility</w:t>
+      </w:r>
+      <w:r>
+        <w:rPr/>
+        <w:t xml:space="preserve">。 </w:t>
       </w:r>
     </w:p>
     <w:p>
@@ -865,13 +893,38 @@
           <w:tab w:val="left" w:pos="789" w:leader="none"/>
         </w:tabs>
         <w:bidi w:val="0"/>
+        <w:spacing w:before="80" w:after="0"/>
         <w:ind w:start="789" w:end="80" w:hanging="283"/>
         <w:jc w:val="start"/>
         <w:rPr/>
       </w:pPr>
       <w:r>
         <w:rPr/>
-        <w:t xml:space="preserve">基于诊断实现 </w:t>
+        <w:t>基于原假设“</w:t>
+      </w:r>
+      <w:r>
+        <w:rPr/>
+        <w:t xml:space="preserve">Camera Equivariance Gap </w:t>
+      </w:r>
+      <w:r>
+        <w:rPr/>
+        <w:t xml:space="preserve">可由 </w:t>
+      </w:r>
+      <w:r>
+        <w:rPr/>
+        <w:t xml:space="preserve">Geo-REPA + Pose/Ray </w:t>
+      </w:r>
+      <w:r>
+        <w:rPr/>
+        <w:t xml:space="preserve">修复并恢复 </w:t>
+      </w:r>
+      <w:r>
+        <w:rPr/>
+        <w:t>future utility”</w:t>
+      </w:r>
+      <w:r>
+        <w:rPr/>
+        <w:t xml:space="preserve">，实现 </w:t>
       </w:r>
       <w:r>
         <w:rPr>
@@ -893,7 +946,7 @@
       </w:r>
       <w:r>
         <w:rPr/>
-        <w:t xml:space="preserve">，并在 </w:t>
+        <w:t xml:space="preserve">，在 </w:t>
       </w:r>
       <w:r>
         <w:rPr>
@@ -911,15 +964,7 @@
       </w:r>
       <w:r>
         <w:rPr/>
-        <w:t xml:space="preserve">B1/G3/G4 </w:t>
-      </w:r>
-      <w:r>
-        <w:rPr/>
-        <w:t xml:space="preserve">单任务 </w:t>
-      </w:r>
-      <w:r>
-        <w:rPr/>
-        <w:t>matched Pilot</w:t>
+        <w:t>B1/G3/G4 matched Pilot</w:t>
       </w:r>
       <w:r>
         <w:rPr/>
@@ -927,7 +972,7 @@
       </w:r>
       <w:r>
         <w:rPr/>
-        <w:t xml:space="preserve">G3 Camera gap </w:t>
+        <w:t xml:space="preserve">G3 gap </w:t>
       </w:r>
       <w:r>
         <w:rPr/>
@@ -983,7 +1028,44 @@
       </w:r>
       <w:r>
         <w:rPr/>
-        <w:t xml:space="preserve">，遂停止预计 </w:t>
+        <w:t xml:space="preserve">，且 </w:t>
+      </w:r>
+      <w:r>
+        <w:rPr/>
+        <w:t xml:space="preserve">G4 gap </w:t>
+      </w:r>
+      <w:r>
+        <w:rPr/>
+        <w:t xml:space="preserve">降幅更大，完整机制链未被支持。 </w:t>
+      </w:r>
+    </w:p>
+    <w:p>
+      <w:pPr>
+        <w:pStyle w:val="TextBody"/>
+        <w:numPr>
+          <w:ilvl w:val="0"/>
+          <w:numId w:val="1"/>
+        </w:numPr>
+        <w:tabs>
+          <w:tab w:val="clear" w:pos="1134"/>
+          <w:tab w:val="left" w:pos="789" w:leader="none"/>
+        </w:tabs>
+        <w:bidi w:val="0"/>
+        <w:ind w:start="789" w:end="80" w:hanging="283"/>
+        <w:jc w:val="start"/>
+        <w:rPr/>
+      </w:pPr>
+      <w:r>
+        <w:rPr/>
+        <w:t xml:space="preserve">未继续调参追正结果，而是冻结五项失败 </w:t>
+      </w:r>
+      <w:r>
+        <w:rPr/>
+        <w:t>Gate</w:t>
+      </w:r>
+      <w:r>
+        <w:rPr/>
+        <w:t xml:space="preserve">、停止预计 </w:t>
       </w:r>
       <w:r>
         <w:rPr>
@@ -1005,7 +1087,7 @@
       </w:r>
       <w:r>
         <w:rPr/>
-        <w:t xml:space="preserve">，并以 </w:t>
+        <w:t xml:space="preserve">，对既有工件做 </w:t>
       </w:r>
       <w:r>
         <w:rPr/>
@@ -1013,31 +1095,31 @@
       </w:r>
       <w:r>
         <w:rPr/>
-        <w:t xml:space="preserve">只读分解定位 </w:t>
-      </w:r>
-      <w:r>
-        <w:rPr/>
-        <w:t>Clean/</w:t>
-      </w:r>
-      <w:r>
-        <w:rPr/>
-        <w:t xml:space="preserve">低 </w:t>
-      </w:r>
-      <w:r>
-        <w:rPr/>
-        <w:t xml:space="preserve">sigma </w:t>
-      </w:r>
-      <w:r>
-        <w:rPr/>
-        <w:t xml:space="preserve">伤害及 </w:t>
-      </w:r>
-      <w:r>
-        <w:rPr/>
-        <w:t xml:space="preserve">RayPose </w:t>
-      </w:r>
-      <w:r>
-        <w:rPr/>
-        <w:t xml:space="preserve">因果缺口。 </w:t>
+        <w:t>失败分解；将问题从“几何不够好”收敛为“</w:t>
+      </w:r>
+      <w:r>
+        <w:rPr/>
+        <w:t xml:space="preserve">future utility </w:t>
+      </w:r>
+      <w:r>
+        <w:rPr/>
+        <w:t xml:space="preserve">具有 </w:t>
+      </w:r>
+      <w:r>
+        <w:rPr/>
+        <w:t>condition/noise-stage dependence”</w:t>
+      </w:r>
+      <w:r>
+        <w:rPr/>
+        <w:t xml:space="preserve">，形成完整的 </w:t>
+      </w:r>
+      <w:r>
+        <w:rPr/>
+        <w:t xml:space="preserve">hypothesis–intervention–falsification </w:t>
+      </w:r>
+      <w:r>
+        <w:rPr/>
+        <w:t xml:space="preserve">闭环。 </w:t>
       </w:r>
     </w:p>
     <w:p>
@@ -1067,47 +1149,15 @@
       </w:pPr>
       <w:r>
         <w:rPr/>
-        <w:t xml:space="preserve">我没有直接把“能生成未来”当成“未来对控制有用”，而是先验证 </w:t>
-      </w:r>
-      <w:r>
-        <w:rPr/>
-        <w:t xml:space="preserve">Clean/OOD </w:t>
-      </w:r>
-      <w:r>
-        <w:rPr/>
-        <w:t xml:space="preserve">行为缺口，再依次检查 </w:t>
-      </w:r>
-      <w:r>
-        <w:rPr/>
-        <w:t xml:space="preserve">shadow-future </w:t>
-      </w:r>
-      <w:r>
-        <w:rPr/>
-        <w:t>关联、</w:t>
-      </w:r>
-      <w:r>
-        <w:rPr/>
-        <w:t xml:space="preserve">future-content </w:t>
-      </w:r>
-      <w:r>
-        <w:rPr/>
-        <w:t xml:space="preserve">动作敏感性和 </w:t>
-      </w:r>
-      <w:r>
-        <w:rPr/>
-        <w:t>K=0/K=1 held-out utility</w:t>
-      </w:r>
-      <w:r>
-        <w:rPr/>
-        <w:t>。</w:t>
-      </w:r>
-      <w:r>
-        <w:rPr/>
-        <w:t xml:space="preserve">K=1 </w:t>
-      </w:r>
-      <w:r>
-        <w:rPr/>
-        <w:t xml:space="preserve">没有正向收益后，我按冻结规则停止 </w:t>
+        <w:t xml:space="preserve">我把原问题拆成 </w:t>
+      </w:r>
+      <w:r>
+        <w:rPr/>
+        <w:t xml:space="preserve">Failure→Representation→Sensitivity→Geometry→Intervention→Failure analysis </w:t>
+      </w:r>
+      <w:r>
+        <w:rPr/>
+        <w:t xml:space="preserve">六层证据。前四阶段确认了 </w:t>
       </w:r>
       <w:r>
         <w:rPr/>
@@ -1115,55 +1165,55 @@
       </w:r>
       <w:r>
         <w:rPr/>
-        <w:t xml:space="preserve">扩展；随后用 </w:t>
-      </w:r>
-      <w:r>
-        <w:rPr/>
-        <w:t xml:space="preserve">exact-state probe </w:t>
-      </w:r>
-      <w:r>
-        <w:rPr/>
-        <w:t xml:space="preserve">定位 </w:t>
-      </w:r>
-      <w:r>
-        <w:rPr/>
-        <w:t xml:space="preserve">Camera </w:t>
-      </w:r>
-      <w:r>
-        <w:rPr/>
-        <w:t xml:space="preserve">等变性缺口，并三卡验证针对性 </w:t>
-      </w:r>
-      <w:r>
-        <w:rPr/>
-        <w:t xml:space="preserve">GeoEq </w:t>
-      </w:r>
-      <w:r>
-        <w:rPr/>
-        <w:t>配方。</w:t>
-      </w:r>
-      <w:r>
-        <w:rPr/>
-        <w:t xml:space="preserve">Pilot </w:t>
-      </w:r>
-      <w:r>
-        <w:rPr/>
-        <w:t xml:space="preserve">仍未过门，所以我停止 </w:t>
-      </w:r>
-      <w:r>
-        <w:rPr/>
-        <w:t>formal</w:t>
-      </w:r>
-      <w:r>
-        <w:rPr/>
-        <w:t xml:space="preserve">，只用已有工件定位下一条 </w:t>
-      </w:r>
-      <w:r>
-        <w:rPr/>
-        <w:t xml:space="preserve">condition-aware/low-noise </w:t>
-      </w:r>
-      <w:r>
-        <w:rPr/>
-        <w:t>假设。</w:t>
+        <w:t>缺口、</w:t>
+      </w:r>
+      <w:r>
+        <w:rPr/>
+        <w:t xml:space="preserve">future </w:t>
+      </w:r>
+      <w:r>
+        <w:rPr/>
+        <w:t xml:space="preserve">关联、动作敏感性和 </w:t>
+      </w:r>
+      <w:r>
+        <w:rPr/>
+        <w:t>Camera Equivariance Gap</w:t>
+      </w:r>
+      <w:r>
+        <w:rPr/>
+        <w:t xml:space="preserve">；但针对性 </w:t>
+      </w:r>
+      <w:r>
+        <w:rPr/>
+        <w:t xml:space="preserve">Geo-REPA + Pose/Ray </w:t>
+      </w:r>
+      <w:r>
+        <w:rPr/>
+        <w:t xml:space="preserve">干预没有恢复 </w:t>
+      </w:r>
+      <w:r>
+        <w:rPr/>
+        <w:t xml:space="preserve">aggregate future utility </w:t>
+      </w:r>
+      <w:r>
+        <w:rPr/>
+        <w:t xml:space="preserve">或 </w:t>
+      </w:r>
+      <w:r>
+        <w:rPr/>
+        <w:t>Camera success</w:t>
+      </w:r>
+      <w:r>
+        <w:rPr/>
+        <w:t xml:space="preserve">。我没有继续调参，而是冻结负结果并做只读分解，最终把下一问题收窄到 </w:t>
+      </w:r>
+      <w:r>
+        <w:rPr/>
+        <w:t>condition/noise-stage dependence</w:t>
+      </w:r>
+      <w:r>
+        <w:rPr/>
+        <w:t>。方法没有涨点，但原假设已被回答，因此这是一个完整的证伪闭环。</w:t>
       </w:r>
     </w:p>
     <w:sectPr>

</xml_diff>